<commit_message>
Api rest (auth), backend (auth), conexión front - DB (auth), actualización Odoo, actualización DB
</commit_message>
<xml_diff>
--- a/Semana 3.docx
+++ b/Semana 3.docx
@@ -9,7 +9,6 @@
     </w:p>
     <w:p/>
     <w:p>
-      <w:bookmarkStart w:id="0" w:name="_GoBack"/>
       <w:r>
         <w:rPr>
           <w:noProof/>
@@ -51,6 +50,51 @@
           </wp:inline>
         </w:drawing>
       </w:r>
+    </w:p>
+    <w:p/>
+    <w:p>
+      <w:r>
+        <w:rPr>
+          <w:noProof/>
+          <w:lang w:eastAsia="es-ES"/>
+        </w:rPr>
+        <w:drawing>
+          <wp:inline distT="0" distB="0" distL="0" distR="0" wp14:anchorId="02220B41" wp14:editId="1B7B5E36">
+            <wp:extent cx="5400040" cy="3023870"/>
+            <wp:effectExtent l="0" t="0" r="0" b="5080"/>
+            <wp:docPr id="2" name="Imagen 2"/>
+            <wp:cNvGraphicFramePr>
+              <a:graphicFrameLocks xmlns:a="http://schemas.openxmlformats.org/drawingml/2006/main" noChangeAspect="1"/>
+            </wp:cNvGraphicFramePr>
+            <a:graphic xmlns:a="http://schemas.openxmlformats.org/drawingml/2006/main">
+              <a:graphicData uri="http://schemas.openxmlformats.org/drawingml/2006/picture">
+                <pic:pic xmlns:pic="http://schemas.openxmlformats.org/drawingml/2006/picture">
+                  <pic:nvPicPr>
+                    <pic:cNvPr id="1" name=""/>
+                    <pic:cNvPicPr/>
+                  </pic:nvPicPr>
+                  <pic:blipFill>
+                    <a:blip r:embed="rId5"/>
+                    <a:stretch>
+                      <a:fillRect/>
+                    </a:stretch>
+                  </pic:blipFill>
+                  <pic:spPr>
+                    <a:xfrm>
+                      <a:off x="0" y="0"/>
+                      <a:ext cx="5400040" cy="3023870"/>
+                    </a:xfrm>
+                    <a:prstGeom prst="rect">
+                      <a:avLst/>
+                    </a:prstGeom>
+                  </pic:spPr>
+                </pic:pic>
+              </a:graphicData>
+            </a:graphic>
+          </wp:inline>
+        </w:drawing>
+      </w:r>
+      <w:bookmarkStart w:id="0" w:name="_GoBack"/>
       <w:bookmarkEnd w:id="0"/>
     </w:p>
     <w:sectPr>

</xml_diff>

<commit_message>
Sistema de partidas con base de datos. Crearv partida, obtener lista de partidas en curso y borrar partidas
</commit_message>
<xml_diff>
--- a/Semana 3.docx
+++ b/Semana 3.docx
@@ -128,6 +128,56 @@
                     <a:xfrm>
                       <a:off x="0" y="0"/>
                       <a:ext cx="5400040" cy="3018155"/>
+                    </a:xfrm>
+                    <a:prstGeom prst="rect">
+                      <a:avLst/>
+                    </a:prstGeom>
+                  </pic:spPr>
+                </pic:pic>
+              </a:graphicData>
+            </a:graphic>
+          </wp:inline>
+        </w:drawing>
+      </w:r>
+    </w:p>
+    <w:p/>
+    <w:p>
+      <w:r>
+        <w:t xml:space="preserve">Semana 4: </w:t>
+      </w:r>
+    </w:p>
+    <w:p/>
+    <w:p>
+      <w:r>
+        <w:rPr>
+          <w:noProof/>
+          <w:lang w:eastAsia="es-ES"/>
+        </w:rPr>
+        <w:drawing>
+          <wp:inline distT="0" distB="0" distL="0" distR="0" wp14:anchorId="45385FBA" wp14:editId="5387CF96">
+            <wp:extent cx="5400040" cy="3019425"/>
+            <wp:effectExtent l="0" t="0" r="0" b="9525"/>
+            <wp:docPr id="4" name="Imagen 4"/>
+            <wp:cNvGraphicFramePr>
+              <a:graphicFrameLocks xmlns:a="http://schemas.openxmlformats.org/drawingml/2006/main" noChangeAspect="1"/>
+            </wp:cNvGraphicFramePr>
+            <a:graphic xmlns:a="http://schemas.openxmlformats.org/drawingml/2006/main">
+              <a:graphicData uri="http://schemas.openxmlformats.org/drawingml/2006/picture">
+                <pic:pic xmlns:pic="http://schemas.openxmlformats.org/drawingml/2006/picture">
+                  <pic:nvPicPr>
+                    <pic:cNvPr id="1" name=""/>
+                    <pic:cNvPicPr/>
+                  </pic:nvPicPr>
+                  <pic:blipFill>
+                    <a:blip r:embed="rId7"/>
+                    <a:stretch>
+                      <a:fillRect/>
+                    </a:stretch>
+                  </pic:blipFill>
+                  <pic:spPr>
+                    <a:xfrm>
+                      <a:off x="0" y="0"/>
+                      <a:ext cx="5400040" cy="3019425"/>
                     </a:xfrm>
                     <a:prstGeom prst="rect">
                       <a:avLst/>

</xml_diff>

<commit_message>
snapshots y arreglo city dialog
</commit_message>
<xml_diff>
--- a/Semana 3.docx
+++ b/Semana 3.docx
@@ -3,11 +3,146 @@
 <w:document xmlns:wpc="http://schemas.microsoft.com/office/word/2010/wordprocessingCanvas" xmlns:cx="http://schemas.microsoft.com/office/drawing/2014/chartex" xmlns:cx1="http://schemas.microsoft.com/office/drawing/2015/9/8/chartex" xmlns:mc="http://schemas.openxmlformats.org/markup-compatibility/2006" xmlns:o="urn:schemas-microsoft-com:office:office" xmlns:r="http://schemas.openxmlformats.org/officeDocument/2006/relationships" xmlns:m="http://schemas.openxmlformats.org/officeDocument/2006/math" xmlns:v="urn:schemas-microsoft-com:vml" xmlns:wp14="http://schemas.microsoft.com/office/word/2010/wordprocessingDrawing" xmlns:wp="http://schemas.openxmlformats.org/drawingml/2006/wordprocessingDrawing" xmlns:w10="urn:schemas-microsoft-com:office:word" xmlns:w="http://schemas.openxmlformats.org/wordprocessingml/2006/main" xmlns:w14="http://schemas.microsoft.com/office/word/2010/wordml" xmlns:w15="http://schemas.microsoft.com/office/word/2012/wordml" xmlns:w16se="http://schemas.microsoft.com/office/word/2015/wordml/symex" xmlns:wpg="http://schemas.microsoft.com/office/word/2010/wordprocessingGroup" xmlns:wpi="http://schemas.microsoft.com/office/word/2010/wordprocessingInk" xmlns:wne="http://schemas.microsoft.com/office/word/2006/wordml" xmlns:wps="http://schemas.microsoft.com/office/word/2010/wordprocessingShape" mc:Ignorable="w14 w15 w16se wp14">
   <w:body>
     <w:p>
-      <w:r>
-        <w:t>Semana 3:</w:t>
-      </w:r>
-      <w:bookmarkStart w:id="0" w:name="_GoBack"/>
-      <w:bookmarkEnd w:id="0"/>
+      <w:pPr>
+        <w:jc w:val="center"/>
+        <w:rPr>
+          <w:b/>
+          <w:sz w:val="72"/>
+          <w:szCs w:val="72"/>
+        </w:rPr>
+      </w:pPr>
+      <w:r>
+        <w:rPr>
+          <w:b/>
+          <w:sz w:val="72"/>
+          <w:szCs w:val="72"/>
+        </w:rPr>
+        <w:t>CONVERGENCE</w:t>
+      </w:r>
+    </w:p>
+    <w:p>
+      <w:pPr>
+        <w:jc w:val="center"/>
+        <w:rPr>
+          <w:b/>
+          <w:sz w:val="40"/>
+          <w:szCs w:val="40"/>
+        </w:rPr>
+      </w:pPr>
+    </w:p>
+    <w:p>
+      <w:pPr>
+        <w:jc w:val="center"/>
+        <w:rPr>
+          <w:b/>
+          <w:sz w:val="40"/>
+          <w:szCs w:val="40"/>
+        </w:rPr>
+      </w:pPr>
+      <w:r>
+        <w:rPr>
+          <w:b/>
+          <w:sz w:val="40"/>
+          <w:szCs w:val="40"/>
+        </w:rPr>
+        <w:t>MARCOS SÁNCHEZ BARJA</w:t>
+      </w:r>
+    </w:p>
+    <w:p>
+      <w:pPr>
+        <w:jc w:val="center"/>
+        <w:rPr>
+          <w:b/>
+          <w:sz w:val="40"/>
+          <w:szCs w:val="40"/>
+        </w:rPr>
+      </w:pPr>
+    </w:p>
+    <w:p>
+      <w:pPr>
+        <w:jc w:val="center"/>
+        <w:rPr>
+          <w:b/>
+          <w:sz w:val="40"/>
+          <w:szCs w:val="40"/>
+        </w:rPr>
+      </w:pPr>
+    </w:p>
+    <w:p>
+      <w:pPr>
+        <w:jc w:val="center"/>
+        <w:rPr>
+          <w:b/>
+          <w:sz w:val="40"/>
+          <w:szCs w:val="40"/>
+        </w:rPr>
+      </w:pPr>
+      <w:r>
+        <w:rPr>
+          <w:b/>
+          <w:sz w:val="40"/>
+          <w:szCs w:val="40"/>
+        </w:rPr>
+        <w:t>HUGO GARCÍA FUILLERAT</w:t>
+      </w:r>
+    </w:p>
+    <w:p>
+      <w:pPr>
+        <w:jc w:val="center"/>
+        <w:rPr>
+          <w:b/>
+          <w:sz w:val="40"/>
+          <w:szCs w:val="40"/>
+        </w:rPr>
+      </w:pPr>
+    </w:p>
+    <w:p>
+      <w:pPr>
+        <w:jc w:val="center"/>
+        <w:rPr>
+          <w:b/>
+          <w:sz w:val="40"/>
+          <w:szCs w:val="40"/>
+        </w:rPr>
+      </w:pPr>
+    </w:p>
+    <w:p>
+      <w:pPr>
+        <w:jc w:val="center"/>
+        <w:rPr>
+          <w:b/>
+          <w:sz w:val="40"/>
+          <w:szCs w:val="40"/>
+        </w:rPr>
+      </w:pPr>
+      <w:r>
+        <w:rPr>
+          <w:b/>
+          <w:sz w:val="40"/>
+          <w:szCs w:val="40"/>
+        </w:rPr>
+        <w:t>MARCO MARTÍN VILA</w:t>
+      </w:r>
+    </w:p>
+    <w:p/>
+    <w:p/>
+    <w:p/>
+    <w:p>
+      <w:pPr>
+        <w:rPr>
+          <w:b/>
+          <w:sz w:val="32"/>
+          <w:szCs w:val="32"/>
+        </w:rPr>
+      </w:pPr>
+      <w:r>
+        <w:rPr>
+          <w:b/>
+          <w:sz w:val="32"/>
+          <w:szCs w:val="32"/>
+        </w:rPr>
+        <w:t>Semana 1:</w:t>
+      </w:r>
     </w:p>
     <w:p/>
     <w:p>
@@ -17,10 +152,10 @@
           <w:lang w:eastAsia="es-ES"/>
         </w:rPr>
         <w:drawing>
-          <wp:inline distT="0" distB="0" distL="0" distR="0" wp14:anchorId="1ADFEF2F" wp14:editId="286F8FA2">
-            <wp:extent cx="5400040" cy="3153410"/>
-            <wp:effectExtent l="0" t="0" r="0" b="8890"/>
-            <wp:docPr id="1" name="Imagen 1"/>
+          <wp:inline distT="0" distB="0" distL="0" distR="0" wp14:anchorId="2897C974" wp14:editId="0652489C">
+            <wp:extent cx="5400040" cy="2745740"/>
+            <wp:effectExtent l="0" t="0" r="0" b="0"/>
+            <wp:docPr id="11" name="Imagen 11"/>
             <wp:cNvGraphicFramePr>
               <a:graphicFrameLocks xmlns:a="http://schemas.openxmlformats.org/drawingml/2006/main" noChangeAspect="1"/>
             </wp:cNvGraphicFramePr>
@@ -40,7 +175,7 @@
                   <pic:spPr>
                     <a:xfrm>
                       <a:off x="0" y="0"/>
-                      <a:ext cx="5400040" cy="3153410"/>
+                      <a:ext cx="5400040" cy="2745740"/>
                     </a:xfrm>
                     <a:prstGeom prst="rect">
                       <a:avLst/>
@@ -60,11 +195,12 @@
           <w:noProof/>
           <w:lang w:eastAsia="es-ES"/>
         </w:rPr>
+        <w:lastRenderedPageBreak/>
         <w:drawing>
-          <wp:inline distT="0" distB="0" distL="0" distR="0" wp14:anchorId="02220B41" wp14:editId="1B7B5E36">
-            <wp:extent cx="5400040" cy="3023870"/>
-            <wp:effectExtent l="0" t="0" r="0" b="5080"/>
-            <wp:docPr id="2" name="Imagen 2"/>
+          <wp:inline distT="0" distB="0" distL="0" distR="0" wp14:anchorId="0D8255EA" wp14:editId="48E0BB72">
+            <wp:extent cx="5400040" cy="2736215"/>
+            <wp:effectExtent l="0" t="0" r="0" b="6985"/>
+            <wp:docPr id="13" name="Imagen 13"/>
             <wp:cNvGraphicFramePr>
               <a:graphicFrameLocks xmlns:a="http://schemas.openxmlformats.org/drawingml/2006/main" noChangeAspect="1"/>
             </wp:cNvGraphicFramePr>
@@ -84,7 +220,7 @@
                   <pic:spPr>
                     <a:xfrm>
                       <a:off x="0" y="0"/>
-                      <a:ext cx="5400040" cy="3023870"/>
+                      <a:ext cx="5400040" cy="2736215"/>
                     </a:xfrm>
                     <a:prstGeom prst="rect">
                       <a:avLst/>
@@ -97,19 +233,25 @@
         </w:drawing>
       </w:r>
     </w:p>
-    <w:p/>
-    <w:p>
-      <w:r>
+    <w:p>
+      <w:pPr>
         <w:rPr>
           <w:noProof/>
           <w:lang w:eastAsia="es-ES"/>
         </w:rPr>
-        <w:lastRenderedPageBreak/>
+      </w:pPr>
+    </w:p>
+    <w:p>
+      <w:r>
+        <w:rPr>
+          <w:noProof/>
+          <w:lang w:eastAsia="es-ES"/>
+        </w:rPr>
         <w:drawing>
-          <wp:inline distT="0" distB="0" distL="0" distR="0" wp14:anchorId="6A08E4AB" wp14:editId="45BA408E">
-            <wp:extent cx="5400040" cy="3018155"/>
+          <wp:inline distT="0" distB="0" distL="0" distR="0" wp14:anchorId="748B8B18" wp14:editId="33E872A6">
+            <wp:extent cx="5400040" cy="2694940"/>
             <wp:effectExtent l="0" t="0" r="0" b="0"/>
-            <wp:docPr id="3" name="Imagen 3"/>
+            <wp:docPr id="15" name="Imagen 15"/>
             <wp:cNvGraphicFramePr>
               <a:graphicFrameLocks xmlns:a="http://schemas.openxmlformats.org/drawingml/2006/main" noChangeAspect="1"/>
             </wp:cNvGraphicFramePr>
@@ -129,7 +271,7 @@
                   <pic:spPr>
                     <a:xfrm>
                       <a:off x="0" y="0"/>
-                      <a:ext cx="5400040" cy="3018155"/>
+                      <a:ext cx="5400040" cy="2694940"/>
                     </a:xfrm>
                     <a:prstGeom prst="rect">
                       <a:avLst/>
@@ -143,9 +285,31 @@
       </w:r>
     </w:p>
     <w:p/>
-    <w:p>
-      <w:r>
-        <w:t xml:space="preserve">Semana 4: </w:t>
+    <w:p/>
+    <w:p/>
+    <w:p>
+      <w:pPr>
+        <w:rPr>
+          <w:b/>
+          <w:sz w:val="32"/>
+          <w:szCs w:val="32"/>
+        </w:rPr>
+      </w:pPr>
+      <w:r>
+        <w:rPr>
+          <w:b/>
+          <w:sz w:val="32"/>
+          <w:szCs w:val="32"/>
+        </w:rPr>
+        <w:t>Semana 2</w:t>
+      </w:r>
+      <w:r>
+        <w:rPr>
+          <w:b/>
+          <w:sz w:val="32"/>
+          <w:szCs w:val="32"/>
+        </w:rPr>
+        <w:t>:</w:t>
       </w:r>
     </w:p>
     <w:p/>
@@ -155,11 +319,12 @@
           <w:noProof/>
           <w:lang w:eastAsia="es-ES"/>
         </w:rPr>
+        <w:lastRenderedPageBreak/>
         <w:drawing>
-          <wp:inline distT="0" distB="0" distL="0" distR="0" wp14:anchorId="45385FBA" wp14:editId="5387CF96">
-            <wp:extent cx="5400040" cy="3019425"/>
-            <wp:effectExtent l="0" t="0" r="0" b="9525"/>
-            <wp:docPr id="4" name="Imagen 4"/>
+          <wp:inline distT="0" distB="0" distL="0" distR="0" wp14:anchorId="1ADFEF2F" wp14:editId="286F8FA2">
+            <wp:extent cx="5400040" cy="3153410"/>
+            <wp:effectExtent l="0" t="0" r="0" b="8890"/>
+            <wp:docPr id="1" name="Imagen 1"/>
             <wp:cNvGraphicFramePr>
               <a:graphicFrameLocks xmlns:a="http://schemas.openxmlformats.org/drawingml/2006/main" noChangeAspect="1"/>
             </wp:cNvGraphicFramePr>
@@ -179,7 +344,7 @@
                   <pic:spPr>
                     <a:xfrm>
                       <a:off x="0" y="0"/>
-                      <a:ext cx="5400040" cy="3019425"/>
+                      <a:ext cx="5400040" cy="3153410"/>
                     </a:xfrm>
                     <a:prstGeom prst="rect">
                       <a:avLst/>
@@ -199,12 +364,11 @@
           <w:noProof/>
           <w:lang w:eastAsia="es-ES"/>
         </w:rPr>
-        <w:lastRenderedPageBreak/>
         <w:drawing>
-          <wp:inline distT="0" distB="0" distL="0" distR="0" wp14:anchorId="3AC02CE5" wp14:editId="242FE941">
-            <wp:extent cx="5400040" cy="2762250"/>
-            <wp:effectExtent l="0" t="0" r="0" b="0"/>
-            <wp:docPr id="5" name="Imagen 5"/>
+          <wp:inline distT="0" distB="0" distL="0" distR="0" wp14:anchorId="02220B41" wp14:editId="1B7B5E36">
+            <wp:extent cx="5400040" cy="3023870"/>
+            <wp:effectExtent l="0" t="0" r="0" b="5080"/>
+            <wp:docPr id="2" name="Imagen 2"/>
             <wp:cNvGraphicFramePr>
               <a:graphicFrameLocks xmlns:a="http://schemas.openxmlformats.org/drawingml/2006/main" noChangeAspect="1"/>
             </wp:cNvGraphicFramePr>
@@ -224,7 +388,7 @@
                   <pic:spPr>
                     <a:xfrm>
                       <a:off x="0" y="0"/>
-                      <a:ext cx="5400040" cy="2762250"/>
+                      <a:ext cx="5400040" cy="3023870"/>
                     </a:xfrm>
                     <a:prstGeom prst="rect">
                       <a:avLst/>
@@ -244,11 +408,12 @@
           <w:noProof/>
           <w:lang w:eastAsia="es-ES"/>
         </w:rPr>
+        <w:lastRenderedPageBreak/>
         <w:drawing>
-          <wp:inline distT="0" distB="0" distL="0" distR="0" wp14:anchorId="3C74EA41" wp14:editId="06F163C2">
-            <wp:extent cx="5400040" cy="2729230"/>
+          <wp:inline distT="0" distB="0" distL="0" distR="0" wp14:anchorId="6A08E4AB" wp14:editId="45BA408E">
+            <wp:extent cx="5400040" cy="3018155"/>
             <wp:effectExtent l="0" t="0" r="0" b="0"/>
-            <wp:docPr id="6" name="Imagen 6"/>
+            <wp:docPr id="3" name="Imagen 3"/>
             <wp:cNvGraphicFramePr>
               <a:graphicFrameLocks xmlns:a="http://schemas.openxmlformats.org/drawingml/2006/main" noChangeAspect="1"/>
             </wp:cNvGraphicFramePr>
@@ -268,7 +433,7 @@
                   <pic:spPr>
                     <a:xfrm>
                       <a:off x="0" y="0"/>
-                      <a:ext cx="5400040" cy="2729230"/>
+                      <a:ext cx="5400040" cy="3018155"/>
                     </a:xfrm>
                     <a:prstGeom prst="rect">
                       <a:avLst/>
@@ -283,25 +448,42 @@
     </w:p>
     <w:p/>
     <w:p>
-      <w:r>
-        <w:t>Semana 5</w:t>
-      </w:r>
-      <w:r>
-        <w:t>:</w:t>
-      </w:r>
-    </w:p>
+      <w:pPr>
+        <w:rPr>
+          <w:b/>
+          <w:sz w:val="32"/>
+          <w:szCs w:val="32"/>
+        </w:rPr>
+      </w:pPr>
+      <w:r>
+        <w:rPr>
+          <w:b/>
+          <w:sz w:val="32"/>
+          <w:szCs w:val="32"/>
+        </w:rPr>
+        <w:t>Semana 3</w:t>
+      </w:r>
+      <w:r>
+        <w:rPr>
+          <w:b/>
+          <w:sz w:val="32"/>
+          <w:szCs w:val="32"/>
+        </w:rPr>
+        <w:t xml:space="preserve">: </w:t>
+      </w:r>
+    </w:p>
+    <w:p/>
     <w:p>
       <w:r>
         <w:rPr>
           <w:noProof/>
           <w:lang w:eastAsia="es-ES"/>
         </w:rPr>
-        <w:lastRenderedPageBreak/>
         <w:drawing>
-          <wp:inline distT="0" distB="0" distL="0" distR="0" wp14:anchorId="0F208486" wp14:editId="7669F2F6">
-            <wp:extent cx="5400040" cy="2549525"/>
-            <wp:effectExtent l="0" t="0" r="0" b="3175"/>
-            <wp:docPr id="7" name="Imagen 7"/>
+          <wp:inline distT="0" distB="0" distL="0" distR="0" wp14:anchorId="45385FBA" wp14:editId="5387CF96">
+            <wp:extent cx="5400040" cy="3019425"/>
+            <wp:effectExtent l="0" t="0" r="0" b="9525"/>
+            <wp:docPr id="4" name="Imagen 4"/>
             <wp:cNvGraphicFramePr>
               <a:graphicFrameLocks xmlns:a="http://schemas.openxmlformats.org/drawingml/2006/main" noChangeAspect="1"/>
             </wp:cNvGraphicFramePr>
@@ -321,7 +503,7 @@
                   <pic:spPr>
                     <a:xfrm>
                       <a:off x="0" y="0"/>
-                      <a:ext cx="5400040" cy="2549525"/>
+                      <a:ext cx="5400040" cy="3019425"/>
                     </a:xfrm>
                     <a:prstGeom prst="rect">
                       <a:avLst/>
@@ -334,17 +516,19 @@
         </w:drawing>
       </w:r>
     </w:p>
+    <w:p/>
     <w:p>
       <w:r>
         <w:rPr>
           <w:noProof/>
           <w:lang w:eastAsia="es-ES"/>
         </w:rPr>
+        <w:lastRenderedPageBreak/>
         <w:drawing>
-          <wp:inline distT="0" distB="0" distL="0" distR="0" wp14:anchorId="055A386F" wp14:editId="5B1B51C8">
-            <wp:extent cx="5400040" cy="2410460"/>
-            <wp:effectExtent l="0" t="0" r="0" b="8890"/>
-            <wp:docPr id="8" name="Imagen 8"/>
+          <wp:inline distT="0" distB="0" distL="0" distR="0" wp14:anchorId="3AC02CE5" wp14:editId="242FE941">
+            <wp:extent cx="5400040" cy="2762250"/>
+            <wp:effectExtent l="0" t="0" r="0" b="0"/>
+            <wp:docPr id="5" name="Imagen 5"/>
             <wp:cNvGraphicFramePr>
               <a:graphicFrameLocks xmlns:a="http://schemas.openxmlformats.org/drawingml/2006/main" noChangeAspect="1"/>
             </wp:cNvGraphicFramePr>
@@ -364,7 +548,7 @@
                   <pic:spPr>
                     <a:xfrm>
                       <a:off x="0" y="0"/>
-                      <a:ext cx="5400040" cy="2410460"/>
+                      <a:ext cx="5400040" cy="2762250"/>
                     </a:xfrm>
                     <a:prstGeom prst="rect">
                       <a:avLst/>
@@ -376,10 +560,8 @@
           </wp:inline>
         </w:drawing>
       </w:r>
-      <w:r>
-        <w:t xml:space="preserve"> </w:t>
-      </w:r>
-    </w:p>
+    </w:p>
+    <w:p/>
     <w:p>
       <w:r>
         <w:rPr>
@@ -387,10 +569,10 @@
           <w:lang w:eastAsia="es-ES"/>
         </w:rPr>
         <w:drawing>
-          <wp:inline distT="0" distB="0" distL="0" distR="0" wp14:anchorId="04B9F0FC" wp14:editId="3E3DE5C2">
-            <wp:extent cx="5400040" cy="2737485"/>
-            <wp:effectExtent l="0" t="0" r="0" b="5715"/>
-            <wp:docPr id="9" name="Imagen 9"/>
+          <wp:inline distT="0" distB="0" distL="0" distR="0" wp14:anchorId="3C74EA41" wp14:editId="06F163C2">
+            <wp:extent cx="5400040" cy="2729230"/>
+            <wp:effectExtent l="0" t="0" r="0" b="0"/>
+            <wp:docPr id="6" name="Imagen 6"/>
             <wp:cNvGraphicFramePr>
               <a:graphicFrameLocks xmlns:a="http://schemas.openxmlformats.org/drawingml/2006/main" noChangeAspect="1"/>
             </wp:cNvGraphicFramePr>
@@ -410,7 +592,7 @@
                   <pic:spPr>
                     <a:xfrm>
                       <a:off x="0" y="0"/>
-                      <a:ext cx="5400040" cy="2737485"/>
+                      <a:ext cx="5400040" cy="2729230"/>
                     </a:xfrm>
                     <a:prstGeom prst="rect">
                       <a:avLst/>
@@ -425,9 +607,31 @@
     </w:p>
     <w:p/>
     <w:p>
-      <w:r>
-        <w:t>Semana 6:</w:t>
-      </w:r>
+      <w:pPr>
+        <w:rPr>
+          <w:b/>
+          <w:sz w:val="32"/>
+          <w:szCs w:val="32"/>
+        </w:rPr>
+      </w:pPr>
+      <w:r>
+        <w:rPr>
+          <w:b/>
+          <w:sz w:val="32"/>
+          <w:szCs w:val="32"/>
+        </w:rPr>
+        <w:t>Semana 4</w:t>
+      </w:r>
+      <w:r>
+        <w:rPr>
+          <w:b/>
+          <w:sz w:val="32"/>
+          <w:szCs w:val="32"/>
+        </w:rPr>
+        <w:t>:</w:t>
+      </w:r>
+      <w:bookmarkStart w:id="0" w:name="_GoBack"/>
+      <w:bookmarkEnd w:id="0"/>
     </w:p>
     <w:p>
       <w:r>
@@ -437,10 +641,10 @@
         </w:rPr>
         <w:lastRenderedPageBreak/>
         <w:drawing>
-          <wp:inline distT="0" distB="0" distL="0" distR="0" wp14:anchorId="0545F05B" wp14:editId="1AD244A1">
-            <wp:extent cx="5400040" cy="3004185"/>
-            <wp:effectExtent l="0" t="0" r="0" b="5715"/>
-            <wp:docPr id="10" name="Imagen 10"/>
+          <wp:inline distT="0" distB="0" distL="0" distR="0" wp14:anchorId="0F208486" wp14:editId="7669F2F6">
+            <wp:extent cx="5400040" cy="2549525"/>
+            <wp:effectExtent l="0" t="0" r="0" b="3175"/>
+            <wp:docPr id="7" name="Imagen 7"/>
             <wp:cNvGraphicFramePr>
               <a:graphicFrameLocks xmlns:a="http://schemas.openxmlformats.org/drawingml/2006/main" noChangeAspect="1"/>
             </wp:cNvGraphicFramePr>
@@ -460,7 +664,7 @@
                   <pic:spPr>
                     <a:xfrm>
                       <a:off x="0" y="0"/>
-                      <a:ext cx="5400040" cy="3004185"/>
+                      <a:ext cx="5400040" cy="2549525"/>
                     </a:xfrm>
                     <a:prstGeom prst="rect">
                       <a:avLst/>
@@ -480,10 +684,10 @@
           <w:lang w:eastAsia="es-ES"/>
         </w:rPr>
         <w:drawing>
-          <wp:inline distT="0" distB="0" distL="0" distR="0" wp14:anchorId="4565C0DD" wp14:editId="4A4E7011">
-            <wp:extent cx="5400040" cy="2768600"/>
-            <wp:effectExtent l="0" t="0" r="0" b="0"/>
-            <wp:docPr id="11" name="Imagen 11"/>
+          <wp:inline distT="0" distB="0" distL="0" distR="0" wp14:anchorId="055A386F" wp14:editId="5B1B51C8">
+            <wp:extent cx="5400040" cy="2410460"/>
+            <wp:effectExtent l="0" t="0" r="0" b="8890"/>
+            <wp:docPr id="8" name="Imagen 8"/>
             <wp:cNvGraphicFramePr>
               <a:graphicFrameLocks xmlns:a="http://schemas.openxmlformats.org/drawingml/2006/main" noChangeAspect="1"/>
             </wp:cNvGraphicFramePr>
@@ -503,7 +707,166 @@
                   <pic:spPr>
                     <a:xfrm>
                       <a:off x="0" y="0"/>
-                      <a:ext cx="5400040" cy="2768600"/>
+                      <a:ext cx="5400040" cy="2410460"/>
+                    </a:xfrm>
+                    <a:prstGeom prst="rect">
+                      <a:avLst/>
+                    </a:prstGeom>
+                  </pic:spPr>
+                </pic:pic>
+              </a:graphicData>
+            </a:graphic>
+          </wp:inline>
+        </w:drawing>
+      </w:r>
+      <w:r>
+        <w:t xml:space="preserve"> </w:t>
+      </w:r>
+    </w:p>
+    <w:p>
+      <w:r>
+        <w:rPr>
+          <w:noProof/>
+          <w:lang w:eastAsia="es-ES"/>
+        </w:rPr>
+        <w:drawing>
+          <wp:inline distT="0" distB="0" distL="0" distR="0" wp14:anchorId="04B9F0FC" wp14:editId="3E3DE5C2">
+            <wp:extent cx="5400040" cy="2737485"/>
+            <wp:effectExtent l="0" t="0" r="0" b="5715"/>
+            <wp:docPr id="9" name="Imagen 9"/>
+            <wp:cNvGraphicFramePr>
+              <a:graphicFrameLocks xmlns:a="http://schemas.openxmlformats.org/drawingml/2006/main" noChangeAspect="1"/>
+            </wp:cNvGraphicFramePr>
+            <a:graphic xmlns:a="http://schemas.openxmlformats.org/drawingml/2006/main">
+              <a:graphicData uri="http://schemas.openxmlformats.org/drawingml/2006/picture">
+                <pic:pic xmlns:pic="http://schemas.openxmlformats.org/drawingml/2006/picture">
+                  <pic:nvPicPr>
+                    <pic:cNvPr id="1" name=""/>
+                    <pic:cNvPicPr/>
+                  </pic:nvPicPr>
+                  <pic:blipFill>
+                    <a:blip r:embed="rId15"/>
+                    <a:stretch>
+                      <a:fillRect/>
+                    </a:stretch>
+                  </pic:blipFill>
+                  <pic:spPr>
+                    <a:xfrm>
+                      <a:off x="0" y="0"/>
+                      <a:ext cx="5400040" cy="2737485"/>
+                    </a:xfrm>
+                    <a:prstGeom prst="rect">
+                      <a:avLst/>
+                    </a:prstGeom>
+                  </pic:spPr>
+                </pic:pic>
+              </a:graphicData>
+            </a:graphic>
+          </wp:inline>
+        </w:drawing>
+      </w:r>
+    </w:p>
+    <w:p/>
+    <w:p>
+      <w:pPr>
+        <w:rPr>
+          <w:b/>
+          <w:sz w:val="32"/>
+          <w:szCs w:val="32"/>
+        </w:rPr>
+      </w:pPr>
+      <w:r>
+        <w:rPr>
+          <w:b/>
+          <w:sz w:val="32"/>
+          <w:szCs w:val="32"/>
+        </w:rPr>
+        <w:t>Semana 5</w:t>
+      </w:r>
+      <w:r>
+        <w:rPr>
+          <w:b/>
+          <w:sz w:val="32"/>
+          <w:szCs w:val="32"/>
+        </w:rPr>
+        <w:t>:</w:t>
+      </w:r>
+    </w:p>
+    <w:p>
+      <w:r>
+        <w:rPr>
+          <w:noProof/>
+          <w:lang w:eastAsia="es-ES"/>
+        </w:rPr>
+        <w:lastRenderedPageBreak/>
+        <w:drawing>
+          <wp:inline distT="0" distB="0" distL="0" distR="0" wp14:anchorId="0545F05B" wp14:editId="1AD244A1">
+            <wp:extent cx="5400040" cy="3004185"/>
+            <wp:effectExtent l="0" t="0" r="0" b="5715"/>
+            <wp:docPr id="10" name="Imagen 10"/>
+            <wp:cNvGraphicFramePr>
+              <a:graphicFrameLocks xmlns:a="http://schemas.openxmlformats.org/drawingml/2006/main" noChangeAspect="1"/>
+            </wp:cNvGraphicFramePr>
+            <a:graphic xmlns:a="http://schemas.openxmlformats.org/drawingml/2006/main">
+              <a:graphicData uri="http://schemas.openxmlformats.org/drawingml/2006/picture">
+                <pic:pic xmlns:pic="http://schemas.openxmlformats.org/drawingml/2006/picture">
+                  <pic:nvPicPr>
+                    <pic:cNvPr id="1" name=""/>
+                    <pic:cNvPicPr/>
+                  </pic:nvPicPr>
+                  <pic:blipFill>
+                    <a:blip r:embed="rId16"/>
+                    <a:stretch>
+                      <a:fillRect/>
+                    </a:stretch>
+                  </pic:blipFill>
+                  <pic:spPr>
+                    <a:xfrm>
+                      <a:off x="0" y="0"/>
+                      <a:ext cx="5400040" cy="3004185"/>
+                    </a:xfrm>
+                    <a:prstGeom prst="rect">
+                      <a:avLst/>
+                    </a:prstGeom>
+                  </pic:spPr>
+                </pic:pic>
+              </a:graphicData>
+            </a:graphic>
+          </wp:inline>
+        </w:drawing>
+      </w:r>
+    </w:p>
+    <w:p>
+      <w:r>
+        <w:rPr>
+          <w:noProof/>
+          <w:lang w:eastAsia="es-ES"/>
+        </w:rPr>
+        <w:drawing>
+          <wp:inline distT="0" distB="0" distL="0" distR="0" wp14:anchorId="0F8A37FF" wp14:editId="727BC381">
+            <wp:extent cx="5400040" cy="2731135"/>
+            <wp:effectExtent l="0" t="0" r="0" b="0"/>
+            <wp:docPr id="12" name="Imagen 12"/>
+            <wp:cNvGraphicFramePr>
+              <a:graphicFrameLocks xmlns:a="http://schemas.openxmlformats.org/drawingml/2006/main" noChangeAspect="1"/>
+            </wp:cNvGraphicFramePr>
+            <a:graphic xmlns:a="http://schemas.openxmlformats.org/drawingml/2006/main">
+              <a:graphicData uri="http://schemas.openxmlformats.org/drawingml/2006/picture">
+                <pic:pic xmlns:pic="http://schemas.openxmlformats.org/drawingml/2006/picture">
+                  <pic:nvPicPr>
+                    <pic:cNvPr id="1" name=""/>
+                    <pic:cNvPicPr/>
+                  </pic:nvPicPr>
+                  <pic:blipFill>
+                    <a:blip r:embed="rId17"/>
+                    <a:stretch>
+                      <a:fillRect/>
+                    </a:stretch>
+                  </pic:blipFill>
+                  <pic:spPr>
+                    <a:xfrm>
+                      <a:off x="0" y="0"/>
+                      <a:ext cx="5400040" cy="2731135"/>
                     </a:xfrm>
                     <a:prstGeom prst="rect">
                       <a:avLst/>

</xml_diff>